<commit_message>
Number research equations and finalize Unicode publication editions
</commit_message>
<xml_diff>
--- a/series/publications/linkedin/2026-10-08_causal_credit_series/publications/UNDERWRITE_FOR_COLLECTION_FIVE_ARTICLE_RESEARCH_EDITION_2026-10-08.docx
+++ b/series/publications/linkedin/2026-10-08_causal_credit_series/publications/UNDERWRITE_FOR_COLLECTION_FIVE_ARTICLE_RESEARCH_EDITION_2026-10-08.docx
@@ -87,7 +87,7 @@
           <w:b/>
           <w:bCs/>
         </w:rPr>
-        <w:t xml:space="preserve">Underwrite for Collection · LinkedIn research article · Draft for review · 8 October 2026</w:t>
+        <w:t xml:space="preserve">Underwrite for Collection · LinkedIn research article · 8 October 2026</w:t>
       </w:r>
     </w:p>
     <w:bookmarkStart w:id="20" w:name="abstract"/>
@@ -200,7 +200,7 @@
         <w:t xml:space="preserve"> </w:t>
       </w:r>
       <w:r>
-        <w:t xml:space="preserve">work began with a practical concern: a credit decision is not complete when funds are disbursed. The loan must fit the borrower’s actual cash generation and the lender must be able to monitor whether that repayment source remains available. For an operating MSME, cash is shaped by sales, working capital, suppliers, seasonality, tax, owner withdrawals and existing obligations. For a ring-fenced receivables stream, repayment depends on eligible invoices, obligor performance, dilution, assignment, account control, servicing continuity, collection timing and the waterfall. A price that appears profitable on a spreadsheet can be uncollectable if its instalment profile conflicts with cash conversion or if the underlying receivable is disputed. Credit experimentation should therefore evaluate the offer as a whole and follow the cash journey after the decision.</w:t>
+        <w:t xml:space="preserve">work began with a practical concern: a credit decision is not complete when funds are disbursed. The loan must fit the borrower’s actual cash generation and the lender must be able to monitor whether that repayment source remains available. For an operating MSME, cash is shaped by sales, working capital, suppliers, seasonality, tax, owner withdrawals and existing obligations. For a ring-fenced receivables stream, repayment depends on eligible invoices, obligor performance, dilution, assignment, account control, servicing continuity, collection timing and the waterfall. A price that appears profitable on a spreadsheet can be uncollectable if its instalment profile conflicts with cash conversion or if the underlying receivable is disputed. Credit experimentation should therefore evaluate the offer as a whole and follow the cash journey after the decision. Financing ring-fenced receivables is the general proposition used throughout this series. In the worked examples that use a special-purpose vehicle (SPV), the vehicle is the chosen structure for holding the receivables and allocating their collections. The underwriting evidence follows the receivables, collection controls and contractual payment priorities of that structure.</w:t>
       </w:r>
     </w:p>
     <w:p>
@@ -2287,7 +2287,7 @@
           <w:b/>
           <w:bCs/>
         </w:rPr>
-        <w:t xml:space="preserve">Underwrite for Collection · Article 2 of 5 · LinkedIn research article · Draft for review · 8 October 2026</w:t>
+        <w:t xml:space="preserve">Underwrite for Collection · Article 2 of 5 · LinkedIn research article · 8 October 2026</w:t>
       </w:r>
     </w:p>
     <w:bookmarkStart w:id="54" w:name="abstract-1"/>
@@ -5857,7 +5857,7 @@
         <w:t xml:space="preserve"> </w:t>
       </w:r>
       <w:r>
-        <w:t xml:space="preserve">Scenario figures in this article are explicitly hypothetical. This draft describes a research and governance pathway; it does not report a completed Kenyan randomized trial, fitted collection controller or production deployment. The legal references should be checked against the institution’s current classification and the authoritative consolidated instruments before publication.</w:t>
+        <w:t xml:space="preserve">Scenario figures in this article are explicitly hypothetical. This article describes a research and governance pathway; it does not report a completed Kenyan randomized trial, fitted collection controller or production deployment. The legal references should be checked against the institution’s current classification and the authoritative consolidated instruments before publication.</w:t>
       </w:r>
     </w:p>
     <w:p>
@@ -7610,7 +7610,7 @@
         <w:pStyle w:val="BodyText"/>
       </w:pPr>
       <w:r>
-        <w:t xml:space="preserve">For financing a ring-fenced receivables stream, the core exposure is identified assets and the collections legally dedicated to repayment. Evidence should cover invoice eligibility, underlying supply, obligor acceptance, concentration, dilution, set-off, dispute, assignment, perfection, account control, servicing continuity, collection timing, reserves and waterfall distributions. The SPV’s available cash can be strong even where the originator’s unrestricted business cash is weak, and the reverse can also occur. Reject inference for an operating-business facility cannot be transferred mechanically to a receivables purchase or SPV facility. The offer, unit of analysis, obligor, legal rights and observed repayment event differ. A trial should record whether cash came from ordinary trading, an assigned invoice, a guarantor, a reserve, owner support or recovery action so that a</w:t>
+        <w:t xml:space="preserve">For financing a ring-fenced receivables stream, the core exposure is identified assets and the collections legally dedicated to repayment. Evidence should cover invoice eligibility, underlying supply, obligor acceptance, concentration, dilution, set-off, dispute, assignment, perfection, account control, servicing continuity, collection timing, reserves and waterfall distributions. The collections dedicated to the receivables facility can be strong even where the originator’s unrestricted business cash is weak, and the reverse can also occur. Where the worked structure uses a special-purpose vehicle (SPV), the analysis follows the receivables held by that vehicle and the collections available under its waterfall. Reject inference for an operating-business facility therefore needs a separately specified outcome and selection model when applied to financing ring-fenced receivables. The offer, unit of analysis, obligor, legal rights and observed repayment event differ. A trial should record whether cash came from ordinary trading, an assigned invoice, a guarantor, a reserve, owner support or recovery action so that a</w:t>
       </w:r>
       <w:r>
         <w:t xml:space="preserve"> </w:t>
@@ -8751,7 +8751,7 @@
           <w:b/>
           <w:bCs/>
         </w:rPr>
-        <w:t xml:space="preserve">Underwrite for Collection · Article 4 of 5 · LinkedIn research article · Draft for review · 8 October 2026</w:t>
+        <w:t xml:space="preserve">Underwrite for Collection · Article 4 of 5 · LinkedIn research article · 8 October 2026</w:t>
       </w:r>
     </w:p>
     <w:bookmarkStart w:id="124" w:name="abstract-3"/>

</xml_diff>